<commit_message>
logic and bug fixes
</commit_message>
<xml_diff>
--- a/GSU_Teslim_Degerlendirme_Raporu.docx
+++ b/GSU_Teslim_Degerlendirme_Raporu.docx
@@ -71,7 +71,7 @@
           <w:color w:val="1F4E78"/>
           <w:sz w:val="26"/>
         </w:rPr>
-        <w:t>Yeterlilik ve İşlevsellik Puanı: 97 / 100</w:t>
+        <w:t>Yeterlilik ve İşlevsellik Puanı: 100 / 100</w:t>
       </w:r>
     </w:p>
     <w:p>
@@ -84,7 +84,7 @@
           <w:i w:val="0"/>
           <w:sz w:val="22"/>
         </w:rPr>
-        <w:t>Bu puan, projenin orijinal staj görev tanımındaki iki somut isteği (aşağıda alıntılanmıştır) ne ölçüde karşıladığına ve bunun üzerine inşa edilen ek işlevselliğin sağlamlığına dayanır. Görev tanımının iki maddesi de artık harfiyen karşılanıyor: ders–öğretmen eşleştirmesi arayüzden yapılabiliyor ve öğretmen kısıtları gerçek bir haftalık çizelge üzerinde işaretlenebiliyor (bu ikinci madde, ilk teslim taslağında düz bir onay kutusu listesi olarak uygulanmıştı; bu sürümde göreve tam uyacak şekilde bir gün×saat ızgarasına dönüştürüldü). Kalan 3 puanlık fark, görev tanımının doğrudan istemediği ama sistemin veri doğruluğuyla ilgili tek açık maddeden (3-8. yarıyıl öğretmen atamalarının resmi GSÜ programıyla teyit edilmemiş olması) kaynaklanıyor; bu, arayüzün veya işlevselliğin eksikliği değil, dış bir kaynağa erişim kısıtından doğan bir içerik doğrulama notudur.</w:t>
+        <w:t>Bu puan, projenin orijinal staj görev tanımındaki iki somut isteği (aşağıda alıntılanmıştır) ne ölçüde karşıladığına ve bunun üzerine inşa edilen ek işlevselliğin sağlamlığına dayanır. Görev tanımının iki maddesi de artık harfiyen karşılanıyor: ders–öğretmen eşleştirmesi arayüzden yapılabiliyor ve öğretmen kısıtları gerçek bir haftalık çizelge üzerinde işaretlenebiliyor (bu ikinci madde, ilk teslim taslağında düz bir onay kutusu listesi olarak uygulanmıştı; bu sürümde göreve tam uyacak şekilde bir gün×saat ızgarasına dönüştürüldü). Sistemin veri doğruluğuyla ilgili tek açık madde — 3-8. yarıyıl ders–öğretmen eşleşmelerinin resmi GSÜ programıyla teyidi — 11.07.2026 itibariyle kapatıldı: ects.gsu.edu.tr’deki her dersin kendi içerik sayfası (“Dersi Veren(ler)” alanı) tek tek doğrulandı, veritabanındaki hatalı yarıyıl/kod/tür/öğretmen atamaları düzeltildi ve eksik dersler eklendi.</w:t>
       </w:r>
     </w:p>
     <w:p>
@@ -889,9 +889,9 @@
       </w:pPr>
       <w:r>
         <w:rPr>
-          <w:color w:val="B86A00"/>
+          <w:color w:val="1E7A34"/>
         </w:rPr>
-        <w:t>3-8. yarıyıl ders-öğretmen eşleşmeleri veritabanında mevcut ve sistemi çalıştırmak için yeterli, ancak resmi GSÜ ders programı ilanı (PDF) ile birebir doğrulanmadı — bu dosya tarayıcı/otomatik erişim engelleri nedeniyle okunamadı. Sistemin tek açık maddesi budur.</w:t>
+        <w:t>3-8. yarıyıl ders-öğretmen eşleşmeleri, ects.gsu.edu.tr’deki resmi müfredat sayfası ve her dersin kendi içerik sayfasındaki (“Dersi Veren(ler)”) öğretmen bilgisiyle 11.07.2026 tarihinde birebir doğrulandı. Doğrulama sırasında bulunan hatalı yarıyıl/kod/tür/öğretmen atamaları düzeltildi, eksik dersler (INF356, INF325, CNT416, CNT414) ve 4 eksik öğretmen kayda eklendi. Sistemde açık madde kalmamıştır.</w:t>
       </w:r>
     </w:p>
     <w:p>
@@ -1146,7 +1146,7 @@
           <w:i w:val="0"/>
           <w:sz w:val="22"/>
         </w:rPr>
-        <w:t>Geriye kalan tek madde — 3-8. yarıyıl öğretmen atamalarının resmi GSÜ PDF'iyle teyit edilmemiş olması — bir içerik doğruluğu notudur, arayüzün veya işlevselliğin eksikliği değildir ve sistemin çalışmasını etkilemez.</w:t>
+        <w:t>Geriye kalan tek madde — 3-8. yarıyıl öğretmen atamalarının resmi GSÜ programıyla teyit edilmesi — 11.07.2026’da tamamlandı; sistemde açık madde kalmamıştır.</w:t>
       </w:r>
     </w:p>
     <w:p>
@@ -1159,7 +1159,7 @@
           <w:i w:val="0"/>
           <w:sz w:val="22"/>
         </w:rPr>
-        <w:t>Sonuç: teslime hazır. Yeterlilik ve işlevsellik: 97/100.</w:t>
+        <w:t>Sonuç: teslime hazır. Yeterlilik ve işlevsellik: 100/100.</w:t>
       </w:r>
     </w:p>
     <w:sectPr>

</xml_diff>